<commit_message>
Remove the wOBA and wRC+ citations from the source list.
Those formulas are not used in the roster, the rates, or the correlations.

Co-authored-by: colbymorris08 <colbymorris08@users.noreply.github.com>
</commit_message>
<xml_diff>
--- a/asian-pitcher-sources.docx
+++ b/asian-pitcher-sources.docx
@@ -46,7 +46,7 @@
           <w:i/>
           <w:sz w:val="22"/>
         </w:rPr>
-        <w:t>Sources for the roster, the rates, and the calculations on that page. wOBA and wRC+ are listed after that. This page does not compute them. The run-prevention outcomes here are ERA+ and bWAR.</w:t>
+        <w:t>Sources for the roster, the rates, and the calculations on that page. The run-prevention outcomes here are ERA+ and bWAR.</w:t>
       </w:r>
     </w:p>
     <w:p>
@@ -470,135 +470,6 @@
         <w:t>. The 1.096 xFIP− factor is cited here and is not the stability result.</w:t>
       </w:r>
     </w:p>
-    <w:p>
-      <w:pPr>
-        <w:pStyle w:val="Heading2"/>
-        <w:spacing w:before="280" w:after="120"/>
-      </w:pPr>
-      <w:r>
-        <w:rPr>
-          <w:rFonts w:ascii="Calibri" w:hAnsi="Calibri"/>
-          <w:color w:val="3D5A80"/>
-        </w:rPr>
-        <w:t>wOBA and wRC+</w:t>
-      </w:r>
-    </w:p>
-    <w:p>
-      <w:pPr>
-        <w:spacing w:after="160" w:line="240" w:lineRule="auto"/>
-      </w:pPr>
-      <w:r>
-        <w:rPr>
-          <w:rFonts w:ascii="Calibri" w:hAnsi="Calibri" w:eastAsia="Calibri"/>
-          <w:b/>
-          <w:sz w:val="22"/>
-        </w:rPr>
-        <w:t>Published formulas. This analysis does not compute wOBA or wRC+. The outcomes on the page are ERA+ and bWAR.</w:t>
-      </w:r>
-    </w:p>
-    <w:p>
-      <w:pPr>
-        <w:pStyle w:val="ListBullet"/>
-        <w:spacing w:after="120" w:line="259" w:lineRule="auto"/>
-      </w:pPr>
-      <w:r>
-        <w:rPr>
-          <w:rFonts w:ascii="Calibri" w:hAnsi="Calibri" w:eastAsia="Calibri"/>
-          <w:sz w:val="22"/>
-        </w:rPr>
-        <w:t>Tango, Tom M., Mitchel G. Lichtman, and Andrew E. Dolphin. 2007. The Book: Playing the Percentages in Baseball. Washington, DC: Potomac Books. Linear weights behind wOBA.</w:t>
-      </w:r>
-    </w:p>
-    <w:p>
-      <w:pPr>
-        <w:pStyle w:val="ListBullet"/>
-        <w:spacing w:after="120" w:line="259" w:lineRule="auto"/>
-      </w:pPr>
-      <w:r>
-        <w:rPr>
-          <w:rFonts w:ascii="Calibri" w:hAnsi="Calibri" w:eastAsia="Calibri"/>
-          <w:sz w:val="22"/>
-        </w:rPr>
-        <w:t xml:space="preserve">FanGraphs. “wOBA.” </w:t>
-      </w:r>
-      <w:hyperlink r:id="rId21">
-        <w:r>
-          <w:rPr>
-            <w:color w:val="3D5A80"/>
-            <w:u w:val="single"/>
-            <w:sz w:val="22"/>
-          </w:rPr>
-          <w:t xml:space="preserve">https://library.fangraphs.com/offense/woba/</w:t>
-        </w:r>
-      </w:hyperlink>
-      <w:r>
-        <w:rPr>
-          <w:rFonts w:ascii="Calibri" w:hAnsi="Calibri" w:eastAsia="Calibri"/>
-          <w:sz w:val="22"/>
-        </w:rPr>
-        <w:t>. wOBA = (wBB·uBB + wHBP·HBP + w1B·1B + w2B·2B + w3B·3B + wHR·HR) / (AB + BB − IBB + SF + HBP). Weights change by season.</w:t>
-      </w:r>
-    </w:p>
-    <w:p>
-      <w:pPr>
-        <w:pStyle w:val="ListBullet"/>
-        <w:spacing w:after="120" w:line="259" w:lineRule="auto"/>
-      </w:pPr>
-      <w:r>
-        <w:rPr>
-          <w:rFonts w:ascii="Calibri" w:hAnsi="Calibri" w:eastAsia="Calibri"/>
-          <w:sz w:val="22"/>
-        </w:rPr>
-        <w:t xml:space="preserve">FanGraphs. Guts! constants, the season weights and the wOBA scale. </w:t>
-      </w:r>
-      <w:hyperlink r:id="rId22">
-        <w:r>
-          <w:rPr>
-            <w:color w:val="3D5A80"/>
-            <w:u w:val="single"/>
-            <w:sz w:val="22"/>
-          </w:rPr>
-          <w:t xml:space="preserve">https://www.fangraphs.com/tools/guts</w:t>
-        </w:r>
-      </w:hyperlink>
-      <w:r>
-        <w:rPr>
-          <w:rFonts w:ascii="Calibri" w:hAnsi="Calibri" w:eastAsia="Calibri"/>
-          <w:sz w:val="22"/>
-        </w:rPr>
-        <w:t>.</w:t>
-      </w:r>
-    </w:p>
-    <w:p>
-      <w:pPr>
-        <w:pStyle w:val="ListBullet"/>
-        <w:spacing w:after="120" w:line="259" w:lineRule="auto"/>
-      </w:pPr>
-      <w:r>
-        <w:rPr>
-          <w:rFonts w:ascii="Calibri" w:hAnsi="Calibri" w:eastAsia="Calibri"/>
-          <w:sz w:val="22"/>
-        </w:rPr>
-        <w:t xml:space="preserve">FanGraphs. “wRC and wRC+.” </w:t>
-      </w:r>
-      <w:hyperlink r:id="rId23">
-        <w:r>
-          <w:rPr>
-            <w:color w:val="3D5A80"/>
-            <w:u w:val="single"/>
-            <w:sz w:val="22"/>
-          </w:rPr>
-          <w:t xml:space="preserve">https://library.fangraphs.com/offense/wrc/</w:t>
-        </w:r>
-      </w:hyperlink>
-      <w:r>
-        <w:rPr>
-          <w:rFonts w:ascii="Calibri" w:hAnsi="Calibri" w:eastAsia="Calibri"/>
-          <w:sz w:val="22"/>
-        </w:rPr>
-        <w:t>. wRC = [((wOBA − league wOBA) / wOBA scale) + (league R/PA)] × PA. wRC+ scales park-adjusted wRC per plate appearance to 100 for a league-average hitter.</w:t>
-      </w:r>
-    </w:p>
     <w:sectPr>
       <w:pgSz w:w="12240" w:h="15840"/>
       <w:pgMar w:top="1440" w:right="1440" w:bottom="1440" w:left="1440" w:header="720" w:footer="720" w:gutter="0"/>

</xml_diff>

<commit_message>
Publish the source list without the wOBA and wRC+ citations.
Co-authored-by: colbymorris08 <colbymorris08@users.noreply.github.com>
</commit_message>
<xml_diff>
--- a/asian-pitcher-sources.docx
+++ b/asian-pitcher-sources.docx
@@ -46,7 +46,7 @@
           <w:i/>
           <w:sz w:val="22"/>
         </w:rPr>
-        <w:t>Sources for the roster, the rates, and the calculations on that page. wOBA and wRC+ are listed after that. This page does not compute them. The run-prevention outcomes here are ERA+ and bWAR.</w:t>
+        <w:t>Sources for the roster, the rates, and the calculations on that page. The run-prevention outcomes here are ERA+ and bWAR.</w:t>
       </w:r>
     </w:p>
     <w:p>
@@ -470,135 +470,6 @@
         <w:t>. The 1.096 xFIP− factor is cited here and is not the stability result.</w:t>
       </w:r>
     </w:p>
-    <w:p>
-      <w:pPr>
-        <w:pStyle w:val="Heading2"/>
-        <w:spacing w:before="280" w:after="120"/>
-      </w:pPr>
-      <w:r>
-        <w:rPr>
-          <w:rFonts w:ascii="Calibri" w:hAnsi="Calibri"/>
-          <w:color w:val="3D5A80"/>
-        </w:rPr>
-        <w:t>wOBA and wRC+</w:t>
-      </w:r>
-    </w:p>
-    <w:p>
-      <w:pPr>
-        <w:spacing w:after="160" w:line="240" w:lineRule="auto"/>
-      </w:pPr>
-      <w:r>
-        <w:rPr>
-          <w:rFonts w:ascii="Calibri" w:hAnsi="Calibri" w:eastAsia="Calibri"/>
-          <w:b/>
-          <w:sz w:val="22"/>
-        </w:rPr>
-        <w:t>Published formulas. This analysis does not compute wOBA or wRC+. The outcomes on the page are ERA+ and bWAR.</w:t>
-      </w:r>
-    </w:p>
-    <w:p>
-      <w:pPr>
-        <w:pStyle w:val="ListBullet"/>
-        <w:spacing w:after="120" w:line="259" w:lineRule="auto"/>
-      </w:pPr>
-      <w:r>
-        <w:rPr>
-          <w:rFonts w:ascii="Calibri" w:hAnsi="Calibri" w:eastAsia="Calibri"/>
-          <w:sz w:val="22"/>
-        </w:rPr>
-        <w:t>Tango, Tom M., Mitchel G. Lichtman, and Andrew E. Dolphin. 2007. The Book: Playing the Percentages in Baseball. Washington, DC: Potomac Books. Linear weights behind wOBA.</w:t>
-      </w:r>
-    </w:p>
-    <w:p>
-      <w:pPr>
-        <w:pStyle w:val="ListBullet"/>
-        <w:spacing w:after="120" w:line="259" w:lineRule="auto"/>
-      </w:pPr>
-      <w:r>
-        <w:rPr>
-          <w:rFonts w:ascii="Calibri" w:hAnsi="Calibri" w:eastAsia="Calibri"/>
-          <w:sz w:val="22"/>
-        </w:rPr>
-        <w:t xml:space="preserve">FanGraphs. “wOBA.” </w:t>
-      </w:r>
-      <w:hyperlink r:id="rId21">
-        <w:r>
-          <w:rPr>
-            <w:color w:val="3D5A80"/>
-            <w:u w:val="single"/>
-            <w:sz w:val="22"/>
-          </w:rPr>
-          <w:t xml:space="preserve">https://library.fangraphs.com/offense/woba/</w:t>
-        </w:r>
-      </w:hyperlink>
-      <w:r>
-        <w:rPr>
-          <w:rFonts w:ascii="Calibri" w:hAnsi="Calibri" w:eastAsia="Calibri"/>
-          <w:sz w:val="22"/>
-        </w:rPr>
-        <w:t>. wOBA = (wBB·uBB + wHBP·HBP + w1B·1B + w2B·2B + w3B·3B + wHR·HR) / (AB + BB − IBB + SF + HBP). Weights change by season.</w:t>
-      </w:r>
-    </w:p>
-    <w:p>
-      <w:pPr>
-        <w:pStyle w:val="ListBullet"/>
-        <w:spacing w:after="120" w:line="259" w:lineRule="auto"/>
-      </w:pPr>
-      <w:r>
-        <w:rPr>
-          <w:rFonts w:ascii="Calibri" w:hAnsi="Calibri" w:eastAsia="Calibri"/>
-          <w:sz w:val="22"/>
-        </w:rPr>
-        <w:t xml:space="preserve">FanGraphs. Guts! constants, the season weights and the wOBA scale. </w:t>
-      </w:r>
-      <w:hyperlink r:id="rId22">
-        <w:r>
-          <w:rPr>
-            <w:color w:val="3D5A80"/>
-            <w:u w:val="single"/>
-            <w:sz w:val="22"/>
-          </w:rPr>
-          <w:t xml:space="preserve">https://www.fangraphs.com/tools/guts</w:t>
-        </w:r>
-      </w:hyperlink>
-      <w:r>
-        <w:rPr>
-          <w:rFonts w:ascii="Calibri" w:hAnsi="Calibri" w:eastAsia="Calibri"/>
-          <w:sz w:val="22"/>
-        </w:rPr>
-        <w:t>.</w:t>
-      </w:r>
-    </w:p>
-    <w:p>
-      <w:pPr>
-        <w:pStyle w:val="ListBullet"/>
-        <w:spacing w:after="120" w:line="259" w:lineRule="auto"/>
-      </w:pPr>
-      <w:r>
-        <w:rPr>
-          <w:rFonts w:ascii="Calibri" w:hAnsi="Calibri" w:eastAsia="Calibri"/>
-          <w:sz w:val="22"/>
-        </w:rPr>
-        <w:t xml:space="preserve">FanGraphs. “wRC and wRC+.” </w:t>
-      </w:r>
-      <w:hyperlink r:id="rId23">
-        <w:r>
-          <w:rPr>
-            <w:color w:val="3D5A80"/>
-            <w:u w:val="single"/>
-            <w:sz w:val="22"/>
-          </w:rPr>
-          <w:t xml:space="preserve">https://library.fangraphs.com/offense/wrc/</w:t>
-        </w:r>
-      </w:hyperlink>
-      <w:r>
-        <w:rPr>
-          <w:rFonts w:ascii="Calibri" w:hAnsi="Calibri" w:eastAsia="Calibri"/>
-          <w:sz w:val="22"/>
-        </w:rPr>
-        <w:t>. wRC = [((wOBA − league wOBA) / wOBA scale) + (league R/PA)] × PA. wRC+ scales park-adjusted wRC per plate appearance to 100 for a league-average hitter.</w:t>
-      </w:r>
-    </w:p>
     <w:sectPr>
       <w:pgSz w:w="12240" w:h="15840"/>
       <w:pgMar w:top="1440" w:right="1440" w:bottom="1440" w:left="1440" w:header="720" w:footer="720" w:gutter="0"/>

</xml_diff>